<commit_message>
Approvals tables of the investigations within the margin; template likewise
The INV-001 and INV-002 Approvals tables ran 16 pt past the right margin (long function names in a pipe
table set at natural width). A separator longer than pandoc's column width gives the table relative
widths, so it wraps to the text width; the cell text is unchanged (INV-001 433/433 grounded).

Co-Authored-By: Claude Opus 5.5 <noreply@anthropic.com>
</commit_message>
<xml_diff>
--- a/pc_package/INV-001_investigation.docx
+++ b/pc_package/INV-001_investigation.docx
@@ -464,15 +464,16 @@
     <w:tbl>
       <w:tblPr>
         <w:tblStyle w:val="Table"/>
-        <w:tblW w:type="auto" w:w="0"/>
+        <w:tblW w:type="pct" w:w="5000"/>
+        <w:tblLayout w:type="fixed"/>
         <w:tblLook w:firstRow="1" w:lastRow="0" w:firstColumn="0" w:lastColumn="0" w:noHBand="0" w:noVBand="0" w:val="0020"/>
       </w:tblPr>
       <w:tblGrid>
+        <w:gridCol w:w="950"/>
+        <w:gridCol w:w="3168"/>
         <w:gridCol w:w="1584"/>
-        <w:gridCol w:w="1584"/>
-        <w:gridCol w:w="1584"/>
-        <w:gridCol w:w="1584"/>
-        <w:gridCol w:w="1584"/>
+        <w:gridCol w:w="1267"/>
+        <w:gridCol w:w="950"/>
       </w:tblGrid>
       <w:tr>
         <w:trPr>
@@ -483,6 +484,7 @@
           <w:p>
             <w:pPr>
               <w:pStyle w:val="Compact"/>
+              <w:jc w:val="left"/>
             </w:pPr>
             <w:r>
               <w:t xml:space="preserve">Role</w:t>
@@ -494,6 +496,7 @@
           <w:p>
             <w:pPr>
               <w:pStyle w:val="Compact"/>
+              <w:jc w:val="left"/>
             </w:pPr>
             <w:r>
               <w:t xml:space="preserve">Function</w:t>
@@ -505,6 +508,7 @@
           <w:p>
             <w:pPr>
               <w:pStyle w:val="Compact"/>
+              <w:jc w:val="left"/>
             </w:pPr>
             <w:r>
               <w:t xml:space="preserve">Name (synthetic)</w:t>
@@ -516,6 +520,7 @@
           <w:p>
             <w:pPr>
               <w:pStyle w:val="Compact"/>
+              <w:jc w:val="left"/>
             </w:pPr>
             <w:r>
               <w:t xml:space="preserve">Signature</w:t>
@@ -527,6 +532,7 @@
           <w:p>
             <w:pPr>
               <w:pStyle w:val="Compact"/>
+              <w:jc w:val="left"/>
             </w:pPr>
             <w:r>
               <w:t xml:space="preserve">Date</w:t>
@@ -540,6 +546,7 @@
           <w:p>
             <w:pPr>
               <w:pStyle w:val="Compact"/>
+              <w:jc w:val="left"/>
             </w:pPr>
             <w:r>
               <w:t xml:space="preserve">Author</w:t>
@@ -551,6 +558,7 @@
           <w:p>
             <w:pPr>
               <w:pStyle w:val="Compact"/>
+              <w:jc w:val="left"/>
             </w:pPr>
             <w:r>
               <w:t xml:space="preserve">Quality Assurance (investigator)</w:t>
@@ -562,6 +570,7 @@
           <w:p>
             <w:pPr>
               <w:pStyle w:val="Compact"/>
+              <w:jc w:val="left"/>
             </w:pPr>
             <w:r>
               <w:t xml:space="preserve">—</w:t>
@@ -573,6 +582,7 @@
           <w:p>
             <w:pPr>
               <w:pStyle w:val="Compact"/>
+              <w:jc w:val="left"/>
             </w:pPr>
             <w:r>
               <w:t xml:space="preserve">—</w:t>
@@ -584,6 +594,7 @@
           <w:p>
             <w:pPr>
               <w:pStyle w:val="Compact"/>
+              <w:jc w:val="left"/>
             </w:pPr>
             <w:r>
               <w:t xml:space="preserve">—</w:t>
@@ -597,6 +608,7 @@
           <w:p>
             <w:pPr>
               <w:pStyle w:val="Compact"/>
+              <w:jc w:val="left"/>
             </w:pPr>
             <w:r>
               <w:t xml:space="preserve">Reviewer</w:t>
@@ -608,6 +620,7 @@
           <w:p>
             <w:pPr>
               <w:pStyle w:val="Compact"/>
+              <w:jc w:val="left"/>
             </w:pPr>
             <w:r>
               <w:t xml:space="preserve">Manufacturing Science &amp; Technology</w:t>
@@ -619,6 +632,7 @@
           <w:p>
             <w:pPr>
               <w:pStyle w:val="Compact"/>
+              <w:jc w:val="left"/>
             </w:pPr>
             <w:r>
               <w:t xml:space="preserve">—</w:t>
@@ -630,6 +644,7 @@
           <w:p>
             <w:pPr>
               <w:pStyle w:val="Compact"/>
+              <w:jc w:val="left"/>
             </w:pPr>
             <w:r>
               <w:t xml:space="preserve">—</w:t>
@@ -641,6 +656,7 @@
           <w:p>
             <w:pPr>
               <w:pStyle w:val="Compact"/>
+              <w:jc w:val="left"/>
             </w:pPr>
             <w:r>
               <w:t xml:space="preserve">—</w:t>
@@ -654,6 +670,7 @@
           <w:p>
             <w:pPr>
               <w:pStyle w:val="Compact"/>
+              <w:jc w:val="left"/>
             </w:pPr>
             <w:r>
               <w:t xml:space="preserve">Reviewer</w:t>
@@ -665,6 +682,7 @@
           <w:p>
             <w:pPr>
               <w:pStyle w:val="Compact"/>
+              <w:jc w:val="left"/>
             </w:pPr>
             <w:r>
               <w:t xml:space="preserve">Analytical Development</w:t>
@@ -676,6 +694,7 @@
           <w:p>
             <w:pPr>
               <w:pStyle w:val="Compact"/>
+              <w:jc w:val="left"/>
             </w:pPr>
             <w:r>
               <w:t xml:space="preserve">—</w:t>
@@ -687,6 +706,7 @@
           <w:p>
             <w:pPr>
               <w:pStyle w:val="Compact"/>
+              <w:jc w:val="left"/>
             </w:pPr>
             <w:r>
               <w:t xml:space="preserve">—</w:t>
@@ -698,6 +718,7 @@
           <w:p>
             <w:pPr>
               <w:pStyle w:val="Compact"/>
+              <w:jc w:val="left"/>
             </w:pPr>
             <w:r>
               <w:t xml:space="preserve">—</w:t>
@@ -711,6 +732,7 @@
           <w:p>
             <w:pPr>
               <w:pStyle w:val="Compact"/>
+              <w:jc w:val="left"/>
             </w:pPr>
             <w:r>
               <w:t xml:space="preserve">Reviewer</w:t>
@@ -722,6 +744,7 @@
           <w:p>
             <w:pPr>
               <w:pStyle w:val="Compact"/>
+              <w:jc w:val="left"/>
             </w:pPr>
             <w:r>
               <w:t xml:space="preserve">Statistics</w:t>
@@ -733,6 +756,7 @@
           <w:p>
             <w:pPr>
               <w:pStyle w:val="Compact"/>
+              <w:jc w:val="left"/>
             </w:pPr>
             <w:r>
               <w:t xml:space="preserve">—</w:t>
@@ -744,6 +768,7 @@
           <w:p>
             <w:pPr>
               <w:pStyle w:val="Compact"/>
+              <w:jc w:val="left"/>
             </w:pPr>
             <w:r>
               <w:t xml:space="preserve">—</w:t>
@@ -755,6 +780,7 @@
           <w:p>
             <w:pPr>
               <w:pStyle w:val="Compact"/>
+              <w:jc w:val="left"/>
             </w:pPr>
             <w:r>
               <w:t xml:space="preserve">—</w:t>
@@ -768,6 +794,7 @@
           <w:p>
             <w:pPr>
               <w:pStyle w:val="Compact"/>
+              <w:jc w:val="left"/>
             </w:pPr>
             <w:r>
               <w:t xml:space="preserve">Approver</w:t>
@@ -779,6 +806,7 @@
           <w:p>
             <w:pPr>
               <w:pStyle w:val="Compact"/>
+              <w:jc w:val="left"/>
             </w:pPr>
             <w:r>
               <w:t xml:space="preserve">Head of Quality</w:t>
@@ -790,6 +818,7 @@
           <w:p>
             <w:pPr>
               <w:pStyle w:val="Compact"/>
+              <w:jc w:val="left"/>
             </w:pPr>
             <w:r>
               <w:t xml:space="preserve">—</w:t>
@@ -801,6 +830,7 @@
           <w:p>
             <w:pPr>
               <w:pStyle w:val="Compact"/>
+              <w:jc w:val="left"/>
             </w:pPr>
             <w:r>
               <w:t xml:space="preserve">—</w:t>
@@ -812,6 +842,7 @@
           <w:p>
             <w:pPr>
               <w:pStyle w:val="Compact"/>
+              <w:jc w:val="left"/>
             </w:pPr>
             <w:r>
               <w:t xml:space="preserve">—</w:t>

</xml_diff>

<commit_message>
Data state of 2026-10-11 through the corpus: criteria at manufacturing scale and the UF/DF allowance in PCMP-001, PCP-005, INV-001, INV-002, PCR-003 (combined alert in the summary and PD-003-08), PCR-005 (load NOR 20-40 restored; pool HCP not qualified at the low end of the ratio, flagged for manufacturing) and PCR-006, annexes re-anchored; PCR-003 and PCR-006 join REV2_READY. Promote PCR-004 (55 pp), PCR-009 (57 pp) and PCR-010 (54 pp) after fix and readability passes; PD-010-08 (aggregate verified at UF/DF); register reasons that repeated the finding now read 'the record gives no reason'
Co-Authored-By: Claude Opus 5.5 <noreply@anthropic.com>
</commit_message>
<xml_diff>
--- a/pc_package/INV-001_investigation.docx
+++ b/pc_package/INV-001_investigation.docx
@@ -1797,7 +1797,7 @@
         <w:pStyle w:val="BodyText"/>
       </w:pPr>
       <w:r>
-        <w:t xml:space="preserve">Of the 61 proven acceptable ranges that Version 1.0 reported with the other parameters varying within their NORs, 29 are wider in the re-analysis, 3 are narrower, 3 have moved, 3 no longer give a range and 23 are unchanged. In the re-analysis, acidic variants at the production bioreactor step and XMuLV clearance at the low-pH viral inactivation step do not meet their Version 2.0 criterion across the whole NOR, although each meets it with every parameter at its set-point (§6.3). At Version 2.0, the Protein A report PCR-005 narrows the NOR of protein load, because over the NOR as it was characterized the scale-down model is not qualified for pool host cell protein (§2). The low-pH viral inactivation report PCR-006 moves the NOR and the set-point of inactivation pH lower and narrows the NORs of hold time and temperature, because XMuLV clearance does not meet its claim at the least favourable combination of the NOR as it was characterized (§6.3). The lowest capability index of the drug substance is now that of acidic variants, at 1.03, against its lower limit. No GMP batch was dispositioned on these documents, and there is no product impact (§6.6).</w:t>
+        <w:t xml:space="preserve">Of the 61 proven acceptable ranges that Version 1.0 reported with the other parameters varying within their NORs, 29 are wider in the re-analysis, 3 are narrower, 3 have moved, 3 no longer give a range and 23 are unchanged. In the re-analysis, acidic variants at the production bioreactor step and XMuLV clearance at the low-pH viral inactivation step do not meet their Version 2.0 criterion across the whole NOR, although each meets it with every parameter at its set-point (§6.3). At Version 2.0, the Protein A report PCR-005 keeps the NOR in force and flags it for discussion with manufacturing, because over that NOR the scale-down model is not qualified for pool host cell protein (§2). The low-pH viral inactivation report PCR-006 moves the NOR and the set-point of inactivation pH lower and narrows the NORs of hold time and temperature, because XMuLV clearance does not meet its claim at the least favourable combination of the NOR as it was characterized (§6.3). The lowest capability index of the drug substance is now that of acidic variants, at 1.03, against its lower limit. No GMP batch was dispositioned on these documents, and there is no product impact (§6.6).</w:t>
       </w:r>
     </w:p>
     <w:bookmarkEnd w:id="23"/>
@@ -2828,7 +2828,7 @@
         <w:pStyle w:val="BodyText"/>
       </w:pPr>
       <w:r>
-        <w:t xml:space="preserve">The re-analysis in §6 uses the same designed experiments and the same results as Version 1.0, with two additions. The first is the fragment results by nrCE-SDS of the designed experiments. They were measured before Version 1.0 was approved (§4.7), in the cation exchange response surface study, in the re-executed anion exchange design, in the virus filtration design and in the retests of retained samples (S-PA-RET and S-VI-RET), but Version 1.0 did not report them. The second is 6 further set-point runs of the Protein A scale-down model (study S-PA-SDM2), made from 2026-09-07 to 2026-09-11, during the investigation.</w:t>
+        <w:t xml:space="preserve">The re-analysis in §6 uses the same designed experiments and the same results as Version 1.0, with three additions. The first is the fragment results by nrCE-SDS of the designed experiments. They were measured before Version 1.0 was approved (§4.7), in the cation exchange response surface study, in the re-executed anion exchange design, in the virus filtration design and in the retests of retained samples (S-PA-RET and S-VI-RET), but Version 1.0 did not report them. The second is 6 further set-point runs of the Protein A scale-down model (study S-PA-SDM2), made from 2026-09-07 to 2026-09-11, during the investigation. The third is the UF/DF univariate study S-UFDF-UNI2. Only its aggregate results enter the re-analysis, in the verification of the platform worst cases (§6.2).</w:t>
       </w:r>
     </w:p>
     <w:p>
@@ -2836,7 +2836,7 @@
         <w:pStyle w:val="BodyText"/>
       </w:pPr>
       <w:r>
-        <w:t xml:space="preserve">The Protein A plan, PCP-005, had planned 3 set-point runs for the qualification of that model (study S-PA-SDM). The further runs were made during the re-analysis, to narrow the confidence interval of the offset of the model for pool host cell protein. Of the Protein A pool attributes, host cell protein comes nearest its criterion of 17,069 ng/mg. On the model that PCR-005 Version 2.0 uses, its upper 95 % prediction limit over the NOR as characterized is 92 % of the criterion, and it rises with lower elution buffer pH and higher protein load. That model is fitted on the log scale, so the offset is a difference of mean logarithms. It is stated as a ratio, the geometric mean of the scale-down runs divided by that of the manufacturing-scale batches. On the planned runs alone, the ratio is 0.935, with a 90 % confidence interval of 0.795 to 1.100. On all runs it is 0.973, with an interval of 0.891 to 1.063. The plan did not foresee the further runs, so the Protein A report PCR-005 Version 2.0 records them as PD-005-01, a discrepancy from the plan. They are not a deviation, because no approved procedure or GMP requirement was departed from.</w:t>
+        <w:t xml:space="preserve">The Protein A plan, PCP-005, had planned 3 set-point runs for the qualification of that model (study S-PA-SDM). The further runs were made during the re-analysis, to narrow the confidence interval of the offset of the model for pool host cell protein. Of the Protein A pool attributes, host cell protein comes nearest its criterion of 16,719 ng/mg. On the model that PCR-005 Version 2.0 uses, its upper 95 % prediction limit over the NOR as characterized is 94 % of the criterion, and it rises with lower elution buffer pH and higher protein load. That model is fitted on the log scale, so the offset is a difference of mean logarithms. It is stated as a ratio, the geometric mean of the scale-down runs divided by that of the manufacturing-scale batches. On the planned runs alone, the ratio is 0.935, with a 90 % confidence interval of 0.795 to 1.100. On all runs it is 0.973, with an interval of 0.891 to 1.063. The plan did not foresee the further runs, so the Protein A report PCR-005 Version 2.0 records them as PD-005-01, a discrepancy from the plan. They are not a deviation, because no approved procedure or GMP requirement was departed from.</w:t>
       </w:r>
     </w:p>
     <w:p>
@@ -2844,7 +2844,7 @@
         <w:pStyle w:val="BodyText"/>
       </w:pPr>
       <w:r>
-        <w:t xml:space="preserve">A scale-down model is qualified for an output when the conclusion against its criterion over the NOR is the same with the offset at either end of that interval (§6.1). Over the NOR as characterized, the model is not qualified for pool host cell protein, on the planned runs alone or on all runs. With the ratio at the low end of its interval, which raises the prediction at manufacturing scale, the upper prediction limit over that NOR is 17,143 ng/mg on all runs, above the criterion. The Protein A report PCR-005 Version 2.0 therefore narrows the NOR of protein load at its high end, from 20–40 g/L resin to 20–39 g/L resin. Over the narrowed NOR, that limit is 16,763 ng/mg on all runs, and the model is qualified. On the planned runs alone it is 18,786 ng/mg, and the model would not be qualified. The further runs therefore made the qualification possible. The decision to make them was taken after the result on the planned runs was known. The qualification therefore rests on runs added after a result was seen, and this is a limitation of it. The qualification rule and the criterion were not changed, and only the number of runs grew. For leached Protein A the model is qualified on either set of runs.</w:t>
+        <w:t xml:space="preserve">A scale-down model is qualified for an output when the conclusion against its criterion over the NOR is the same with the offset at either end of that interval (§6.1). Over the NOR, the model is not qualified for pool host cell protein, on the planned runs alone or on all runs. The conclusion holds with the ratio at its estimate. With the ratio at the low end of its interval, which raises the prediction at manufacturing scale, the upper prediction limit over the NOR is 17,143 ng/mg on all runs, above the criterion. NORs come from production, and an offset does not narrow them. The Protein A report PCR-005 Version 2.0 therefore keeps the NOR in force, states that the model is not qualified for pool host cell protein over it, and flags the NOR for discussion with manufacturing. The further runs narrowed the interval but did not change the conclusion. The decision to make them was taken after the result on the planned runs was known. The qualification rule and the criterion were not changed, and only the number of runs grew. For leached Protein A the model is qualified on either set of runs.</w:t>
       </w:r>
     </w:p>
     <w:bookmarkEnd w:id="26"/>
@@ -3379,7 +3379,7 @@
                     <w:jc w:val="center"/>
                   </w:pPr>
                   <w:r>
-                    <w:t xml:space="preserve">≤ 6.46</w:t>
+                    <w:t xml:space="preserve">≤ 6.30</w:t>
                   </w:r>
                 </w:p>
               </w:tc>
@@ -3775,7 +3775,7 @@
                     <w:jc w:val="center"/>
                   </w:pPr>
                   <w:r>
-                    <w:t xml:space="preserve">≤ 17,069</w:t>
+                    <w:t xml:space="preserve">≤ 16,719</w:t>
                   </w:r>
                 </w:p>
               </w:tc>
@@ -3940,7 +3940,7 @@
                     <w:jc w:val="center"/>
                   </w:pPr>
                   <w:r>
-                    <w:t xml:space="preserve">≤ 7.02</w:t>
+                    <w:t xml:space="preserve">≤ 6.84</w:t>
                   </w:r>
                 </w:p>
               </w:tc>
@@ -4176,19 +4176,31 @@
                     <w:jc w:val="center"/>
                   </w:pPr>
                   <w:r>
-                    <w:t xml:space="preserve">≤ 5.00</w:t>
-                  </w:r>
-                </w:p>
-              </w:tc>
-              <w:tc>
-                <w:tcPr/>
-                <w:p>
-                  <w:pPr>
-                    <w:pStyle w:val="Compact"/>
-                    <w:jc w:val="center"/>
-                  </w:pPr>
-                  <w:r>
-                    <w:t xml:space="preserve">Drug substance</w:t>
+                    <w:t xml:space="preserve">≤ 4.90</w:t>
+                  </w:r>
+                </w:p>
+              </w:tc>
+              <w:tc>
+                <w:tcPr/>
+                <w:p>
+                  <w:pPr>
+                    <w:pStyle w:val="Compact"/>
+                    <w:jc w:val="center"/>
+                  </w:pPr>
+                  <w:r>
+                    <w:t xml:space="preserve">Carried back, tightened</w:t>
+                  </w:r>
+                  <w:r>
+                    <w:rPr>
+                      <w:vertAlign w:val="superscript"/>
+                    </w:rPr>
+                    <w:t xml:space="preserve">b)</w:t>
+                  </w:r>
+                  <w:r>
+                    <w:t xml:space="preserve"> </w:t>
+                  </w:r>
+                  <w:r>
+                    <w:t xml:space="preserve">from ≤ 5.00</w:t>
                   </w:r>
                 </w:p>
               </w:tc>
@@ -4247,7 +4259,7 @@
                     <w:jc w:val="center"/>
                   </w:pPr>
                   <w:r>
-                    <w:t xml:space="preserve">≤ 427</w:t>
+                    <w:t xml:space="preserve">≤ 418</w:t>
                   </w:r>
                 </w:p>
               </w:tc>
@@ -10730,7 +10742,7 @@
         <w:t xml:space="preserve"> </w:t>
       </w:r>
       <w:r>
-        <w:t xml:space="preserve">gives the 22 criteria with their derivation. Of these, 9 are the drug-substance criterion applied directly, 8 are carried back through the downstream steps, and 5 are platform viral clearance claims. When the platform worst cases were verified (§6.2), 2 of the back-calculated criteria were tightened and 3 were widened. The criterion for aggregates at the production bioreactor step is counted in both, because one downstream step tightened it and another widened it.</w:t>
+        <w:t xml:space="preserve">gives the 22 criteria with their derivation. Of these, 8 are the drug-substance criterion applied directly, 9 are carried back through the downstream steps, and 5 are platform viral clearance claims. When the platform worst cases were verified (§6.2), 3 of the back-calculated criteria were tightened and 3 were widened. The criterion for aggregates at the production bioreactor step is counted in both, because two downstream steps tightened it and another widened it.</w:t>
       </w:r>
     </w:p>
     <w:tbl>
@@ -10994,7 +11006,7 @@
                     <w:jc w:val="center"/>
                   </w:pPr>
                   <w:r>
-                    <w:t xml:space="preserve">171</w:t>
+                    <w:t xml:space="preserve">167</w:t>
                   </w:r>
                 </w:p>
               </w:tc>
@@ -11018,7 +11030,7 @@
                     <w:jc w:val="center"/>
                   </w:pPr>
                   <w:r>
-                    <w:t xml:space="preserve">≤ 17,069</w:t>
+                    <w:t xml:space="preserve">≤ 16,719</w:t>
                   </w:r>
                 </w:p>
               </w:tc>
@@ -11080,7 +11092,7 @@
                     <w:jc w:val="center"/>
                   </w:pPr>
                   <w:r>
-                    <w:t xml:space="preserve">4.27</w:t>
+                    <w:t xml:space="preserve">4.18</w:t>
                   </w:r>
                 </w:p>
               </w:tc>
@@ -11104,7 +11116,7 @@
                     <w:jc w:val="center"/>
                   </w:pPr>
                   <w:r>
-                    <w:t xml:space="preserve">≤ 427</w:t>
+                    <w:t xml:space="preserve">≤ 418</w:t>
                   </w:r>
                 </w:p>
               </w:tc>
@@ -11274,19 +11286,19 @@
                     <w:jc w:val="center"/>
                   </w:pPr>
                   <w:r>
-                    <w:t xml:space="preserve">0.56</w:t>
-                  </w:r>
-                </w:p>
-              </w:tc>
-              <w:tc>
-                <w:tcPr/>
-                <w:p>
-                  <w:pPr>
-                    <w:pStyle w:val="Compact"/>
-                    <w:jc w:val="center"/>
-                  </w:pPr>
-                  <w:r>
-                    <w:t xml:space="preserve">≤ 6.46</w:t>
+                    <w:t xml:space="preserve">0.64</w:t>
+                  </w:r>
+                </w:p>
+              </w:tc>
+              <w:tc>
+                <w:tcPr/>
+                <w:p>
+                  <w:pPr>
+                    <w:pStyle w:val="Compact"/>
+                    <w:jc w:val="center"/>
+                  </w:pPr>
+                  <w:r>
+                    <w:t xml:space="preserve">≤ 6.30</w:t>
                   </w:r>
                 </w:p>
               </w:tc>
@@ -11372,19 +11384,19 @@
                     <w:jc w:val="center"/>
                   </w:pPr>
                   <w:r>
-                    <w:t xml:space="preserve">0.00</w:t>
-                  </w:r>
-                </w:p>
-              </w:tc>
-              <w:tc>
-                <w:tcPr/>
-                <w:p>
-                  <w:pPr>
-                    <w:pStyle w:val="Compact"/>
-                    <w:jc w:val="center"/>
-                  </w:pPr>
-                  <w:r>
-                    <w:t xml:space="preserve">≤ 7.02</w:t>
+                    <w:t xml:space="preserve">0.10</w:t>
+                  </w:r>
+                </w:p>
+              </w:tc>
+              <w:tc>
+                <w:tcPr/>
+                <w:p>
+                  <w:pPr>
+                    <w:pStyle w:val="Compact"/>
+                    <w:jc w:val="center"/>
+                  </w:pPr>
+                  <w:r>
+                    <w:t xml:space="preserve">≤ 6.84</w:t>
                   </w:r>
                 </w:p>
               </w:tc>
@@ -11458,37 +11470,37 @@
                     <w:jc w:val="center"/>
                   </w:pPr>
                   <w:r>
-                    <w:t xml:space="preserve">0.00</w:t>
-                  </w:r>
-                </w:p>
-              </w:tc>
-              <w:tc>
-                <w:tcPr/>
-                <w:p>
-                  <w:pPr>
-                    <w:pStyle w:val="Compact"/>
-                    <w:jc w:val="center"/>
-                  </w:pPr>
-                  <w:r>
-                    <w:t xml:space="preserve">≤ 5.00</w:t>
-                  </w:r>
-                </w:p>
-              </w:tc>
-              <w:tc>
-                <w:tcPr/>
-                <w:p>
-                  <w:pPr>
-                    <w:pStyle w:val="Compact"/>
-                    <w:jc w:val="center"/>
-                  </w:pPr>
-                  <w:r>
-                    <w:t xml:space="preserve">DS criterion</w:t>
+                    <w:t xml:space="preserve">0.10</w:t>
+                  </w:r>
+                </w:p>
+              </w:tc>
+              <w:tc>
+                <w:tcPr/>
+                <w:p>
+                  <w:pPr>
+                    <w:pStyle w:val="Compact"/>
+                    <w:jc w:val="center"/>
+                  </w:pPr>
+                  <w:r>
+                    <w:t xml:space="preserve">≤ 4.90</w:t>
+                  </w:r>
+                </w:p>
+              </w:tc>
+              <w:tc>
+                <w:tcPr/>
+                <w:p>
+                  <w:pPr>
+                    <w:pStyle w:val="Compact"/>
+                    <w:jc w:val="center"/>
+                  </w:pPr>
+                  <w:r>
+                    <w:t xml:space="preserve">Carried back, tightened</w:t>
                   </w:r>
                   <w:r>
                     <w:rPr>
                       <w:vertAlign w:val="superscript"/>
                     </w:rPr>
-                    <w:t xml:space="preserve">b)</w:t>
+                    <w:t xml:space="preserve">c)</w:t>
                   </w:r>
                 </w:p>
               </w:tc>
@@ -13057,7 +13069,7 @@
         <w:pStyle w:val="FirstParagraph"/>
       </w:pPr>
       <w:r>
-        <w:t xml:space="preserve">The platform worst cases are assumptions about A-Mab. Each was checked against the data of the downstream step it describes, under the first rule of CA1 in §6.1. The value observed at the edges of the characterization range is shown for information.</w:t>
+        <w:t xml:space="preserve">The platform worst cases are assumptions about A-Mab. Each was checked against the data of the downstream step it describes, under the first rule of CA1 in §6.1. Each prediction of the downstream step is converted to manufacturing scale with the offset of its scale-down model before the fold or the increase is computed, under the second rule of CA1. The value observed at the edges of the characterization range is shown for information.</w:t>
       </w:r>
       <w:r>
         <w:t xml:space="preserve"> </w:t>
@@ -13074,7 +13086,7 @@
         <w:t xml:space="preserve"> </w:t>
       </w:r>
       <w:r>
-        <w:t xml:space="preserve">gives the result. Of the 7 assumptions that could be tested, 6 were confirmed, because the prediction within the NOR was no worse than the platform value. For 2 of them the single-batch bound was also better than the platform value, on a model that meets the first three adequacy criteria of PCMP-001 §7.2, and the criteria upstream were recalculated with the bound. For the increase of acidic variants at low-pH viral inactivation the bound was also better, but the acidic-variant results of that design have no scatter. The model fits them exactly, so the lack-of-fit test and the model F-test cannot be applied, and the platform value stands. For the other three the single-batch bound was not better than the platform value, so the platform value stands.</w:t>
+        <w:t xml:space="preserve">gives the result. Of the 8 assumptions that could be tested, 6 were confirmed, because the prediction within the NOR was no worse than the platform value. For 2 of them the single-batch bound was also better than the platform value, on a model that meets the first three adequacy criteria of PCMP-001 §7.2, and the criteria upstream were recalculated with the bound. For the increase of acidic variants at low-pH viral inactivation the bound was also better, but the acidic-variant results of that design have no scatter. The model fits them exactly, so the lack-of-fit test and the model F-test cannot be applied, and the platform value stands. For the other three the single-batch bound was not better than the platform value, so the platform value stands.</w:t>
       </w:r>
     </w:p>
     <w:tbl>
@@ -13379,31 +13391,31 @@
                     <w:jc w:val="center"/>
                   </w:pPr>
                   <w:r>
-                    <w:t xml:space="preserve">0.84</w:t>
-                  </w:r>
-                </w:p>
-              </w:tc>
-              <w:tc>
-                <w:tcPr/>
-                <w:p>
-                  <w:pPr>
-                    <w:pStyle w:val="Compact"/>
-                    <w:jc w:val="center"/>
-                  </w:pPr>
-                  <w:r>
-                    <w:t xml:space="preserve">0.53</w:t>
-                  </w:r>
-                </w:p>
-              </w:tc>
-              <w:tc>
-                <w:tcPr/>
-                <w:p>
-                  <w:pPr>
-                    <w:pStyle w:val="Compact"/>
-                    <w:jc w:val="center"/>
-                  </w:pPr>
-                  <w:r>
-                    <w:t xml:space="preserve">0.56</w:t>
+                    <w:t xml:space="preserve">0.82</w:t>
+                  </w:r>
+                </w:p>
+              </w:tc>
+              <w:tc>
+                <w:tcPr/>
+                <w:p>
+                  <w:pPr>
+                    <w:pStyle w:val="Compact"/>
+                    <w:jc w:val="center"/>
+                  </w:pPr>
+                  <w:r>
+                    <w:t xml:space="preserve">0.50</w:t>
+                  </w:r>
+                </w:p>
+              </w:tc>
+              <w:tc>
+                <w:tcPr/>
+                <w:p>
+                  <w:pPr>
+                    <w:pStyle w:val="Compact"/>
+                    <w:jc w:val="center"/>
+                  </w:pPr>
+                  <w:r>
+                    <w:t xml:space="preserve">0.54</w:t>
                   </w:r>
                 </w:p>
               </w:tc>
@@ -13569,31 +13581,31 @@
                     <w:jc w:val="center"/>
                   </w:pPr>
                   <w:r>
-                    <w:t xml:space="preserve">0.60</w:t>
-                  </w:r>
-                </w:p>
-              </w:tc>
-              <w:tc>
-                <w:tcPr/>
-                <w:p>
-                  <w:pPr>
-                    <w:pStyle w:val="Compact"/>
-                    <w:jc w:val="center"/>
-                  </w:pPr>
-                  <w:r>
-                    <w:t xml:space="preserve">0.40</w:t>
-                  </w:r>
-                </w:p>
-              </w:tc>
-              <w:tc>
-                <w:tcPr/>
-                <w:p>
-                  <w:pPr>
-                    <w:pStyle w:val="Compact"/>
-                    <w:jc w:val="center"/>
-                  </w:pPr>
-                  <w:r>
-                    <w:t xml:space="preserve">0.40</w:t>
+                    <w:t xml:space="preserve">0.33</w:t>
+                  </w:r>
+                </w:p>
+              </w:tc>
+              <w:tc>
+                <w:tcPr/>
+                <w:p>
+                  <w:pPr>
+                    <w:pStyle w:val="Compact"/>
+                    <w:jc w:val="center"/>
+                  </w:pPr>
+                  <w:r>
+                    <w:t xml:space="preserve">0.13</w:t>
+                  </w:r>
+                </w:p>
+              </w:tc>
+              <w:tc>
+                <w:tcPr/>
+                <w:p>
+                  <w:pPr>
+                    <w:pStyle w:val="Compact"/>
+                    <w:jc w:val="center"/>
+                  </w:pPr>
+                  <w:r>
+                    <w:t xml:space="preserve">0.13</w:t>
                   </w:r>
                 </w:p>
               </w:tc>
@@ -13677,31 +13689,31 @@
                     <w:jc w:val="center"/>
                   </w:pPr>
                   <w:r>
-                    <w:t xml:space="preserve">30.3</w:t>
-                  </w:r>
-                </w:p>
-              </w:tc>
-              <w:tc>
-                <w:tcPr/>
-                <w:p>
-                  <w:pPr>
-                    <w:pStyle w:val="Compact"/>
-                    <w:jc w:val="center"/>
-                  </w:pPr>
-                  <w:r>
-                    <w:t xml:space="preserve">44.9</w:t>
-                  </w:r>
-                </w:p>
-              </w:tc>
-              <w:tc>
-                <w:tcPr/>
-                <w:p>
-                  <w:pPr>
-                    <w:pStyle w:val="Compact"/>
-                    <w:jc w:val="center"/>
-                  </w:pPr>
-                  <w:r>
-                    <w:t xml:space="preserve">36.7</w:t>
+                    <w:t xml:space="preserve">27.2</w:t>
+                  </w:r>
+                </w:p>
+              </w:tc>
+              <w:tc>
+                <w:tcPr/>
+                <w:p>
+                  <w:pPr>
+                    <w:pStyle w:val="Compact"/>
+                    <w:jc w:val="center"/>
+                  </w:pPr>
+                  <w:r>
+                    <w:t xml:space="preserve">40.2</w:t>
+                  </w:r>
+                </w:p>
+              </w:tc>
+              <w:tc>
+                <w:tcPr/>
+                <w:p>
+                  <w:pPr>
+                    <w:pStyle w:val="Compact"/>
+                    <w:jc w:val="center"/>
+                  </w:pPr>
+                  <w:r>
+                    <w:t xml:space="preserve">32.9</w:t>
                   </w:r>
                 </w:p>
               </w:tc>
@@ -13769,7 +13781,7 @@
                     <w:jc w:val="center"/>
                   </w:pPr>
                   <w:r>
-                    <w:t xml:space="preserve">1.01</w:t>
+                    <w:t xml:space="preserve">1.00</w:t>
                   </w:r>
                 </w:p>
               </w:tc>
@@ -14033,31 +14045,31 @@
                     <w:jc w:val="center"/>
                   </w:pPr>
                   <w:r>
-                    <w:t xml:space="preserve">3.63</w:t>
-                  </w:r>
-                </w:p>
-              </w:tc>
-              <w:tc>
-                <w:tcPr/>
-                <w:p>
-                  <w:pPr>
-                    <w:pStyle w:val="Compact"/>
-                    <w:jc w:val="center"/>
-                  </w:pPr>
-                  <w:r>
-                    <w:t xml:space="preserve">5.51</w:t>
-                  </w:r>
-                </w:p>
-              </w:tc>
-              <w:tc>
-                <w:tcPr/>
-                <w:p>
-                  <w:pPr>
-                    <w:pStyle w:val="Compact"/>
-                    <w:jc w:val="center"/>
-                  </w:pPr>
-                  <w:r>
-                    <w:t xml:space="preserve">4.27</w:t>
+                    <w:t xml:space="preserve">3.55</w:t>
+                  </w:r>
+                </w:p>
+              </w:tc>
+              <w:tc>
+                <w:tcPr/>
+                <w:p>
+                  <w:pPr>
+                    <w:pStyle w:val="Compact"/>
+                    <w:jc w:val="center"/>
+                  </w:pPr>
+                  <w:r>
+                    <w:t xml:space="preserve">5.40</w:t>
+                  </w:r>
+                </w:p>
+              </w:tc>
+              <w:tc>
+                <w:tcPr/>
+                <w:p>
+                  <w:pPr>
+                    <w:pStyle w:val="Compact"/>
+                    <w:jc w:val="center"/>
+                  </w:pPr>
+                  <w:r>
+                    <w:t xml:space="preserve">4.18</w:t>
                   </w:r>
                 </w:p>
               </w:tc>
@@ -14140,6 +14152,110 @@
                       <w:vertAlign w:val="superscript"/>
                     </w:rPr>
                     <w:t xml:space="preserve">d)</w:t>
+                  </w:r>
+                </w:p>
+              </w:tc>
+            </w:tr>
+            <w:tr>
+              <w:tc>
+                <w:tcPr/>
+                <w:p>
+                  <w:pPr>
+                    <w:pStyle w:val="Compact"/>
+                    <w:jc w:val="center"/>
+                  </w:pPr>
+                  <w:r>
+                    <w:t xml:space="preserve">UF/DF</w:t>
+                  </w:r>
+                </w:p>
+              </w:tc>
+              <w:tc>
+                <w:tcPr/>
+                <w:p>
+                  <w:pPr>
+                    <w:pStyle w:val="Compact"/>
+                    <w:jc w:val="center"/>
+                  </w:pPr>
+                  <w:r>
+                    <w:t xml:space="preserve">Aggregates, HMW</w:t>
+                  </w:r>
+                </w:p>
+              </w:tc>
+              <w:tc>
+                <w:tcPr/>
+                <w:p>
+                  <w:pPr>
+                    <w:pStyle w:val="Compact"/>
+                    <w:jc w:val="center"/>
+                  </w:pPr>
+                  <w:r>
+                    <w:t xml:space="preserve">Increase, largest (points)</w:t>
+                  </w:r>
+                </w:p>
+              </w:tc>
+              <w:tc>
+                <w:tcPr/>
+                <w:p>
+                  <w:pPr>
+                    <w:pStyle w:val="Compact"/>
+                    <w:jc w:val="center"/>
+                  </w:pPr>
+                  <w:r>
+                    <w:t xml:space="preserve">0.00</w:t>
+                  </w:r>
+                </w:p>
+              </w:tc>
+              <w:tc>
+                <w:tcPr/>
+                <w:p>
+                  <w:pPr>
+                    <w:pStyle w:val="Compact"/>
+                    <w:jc w:val="center"/>
+                  </w:pPr>
+                  <w:r>
+                    <w:t xml:space="preserve">0.07</w:t>
+                  </w:r>
+                </w:p>
+              </w:tc>
+              <w:tc>
+                <w:tcPr/>
+                <w:p>
+                  <w:pPr>
+                    <w:pStyle w:val="Compact"/>
+                    <w:jc w:val="center"/>
+                  </w:pPr>
+                  <w:r>
+                    <w:t xml:space="preserve">0.06</w:t>
+                  </w:r>
+                </w:p>
+              </w:tc>
+              <w:tc>
+                <w:tcPr/>
+                <w:p>
+                  <w:pPr>
+                    <w:pStyle w:val="Compact"/>
+                    <w:jc w:val="center"/>
+                  </w:pPr>
+                  <w:r>
+                    <w:t xml:space="preserve">0.10</w:t>
+                  </w:r>
+                </w:p>
+              </w:tc>
+              <w:tc>
+                <w:tcPr/>
+                <w:p>
+                  <w:pPr>
+                    <w:pStyle w:val="Compact"/>
+                    <w:jc w:val="center"/>
+                  </w:pPr>
+                  <w:r>
+                    <w:t xml:space="preserve">Not confirmed, tightened</w:t>
+                  </w:r>
+                  <w:r>
+                    <w:rPr>
+                      <w:vertAlign w:val="superscript"/>
+                    </w:rPr>
+                    <w:t xml:space="preserve">c)</w:t>
                   </w:r>
                 </w:p>
               </w:tc>
@@ -14271,7 +14387,7 @@
         <w:pStyle w:val="BodyText"/>
       </w:pPr>
       <w:r>
-        <w:t xml:space="preserve">At the edges of the characterization range, cation exchange cleared host cell protein 30.3-fold, short of the platform worst case of 40.0-fold. Within the NOR, the lowest clearance the model predicts is 44.9-fold, and the single-batch bound is 36.7-fold. The edges of the characterization range lie outside the NOR, so the edge value does not decide the criterion. The prediction within the NOR confirms the platform value. The single-batch bound is below it, so the platform value of 40.0-fold stands for cation exchange. The verification used the models that INV-002 corrective action CA3 selects for each output (§2). At anion exchange, the single-batch bound for host cell protein is 4.27-fold, which is better than the platform value of 4.00-fold. The anion exchange model passes the adequacy tests, so this bound replaced the platform value. The anion exchange bound widened the cation exchange criterion for host cell protein from 400 to 427 ng/mg. Carried back through the platform value at cation exchange and this bound at anion exchange, the Protein A criterion for host cell protein was widened from 16,000 to 17,069 ng/mg. The Protein A criterion is also wider than the Version 1.0 limit of 10,724 ng/mg, which was never an approved criterion (finding F1). In all, 3 criteria were widened, for aggregates at the production bioreactor step, host cell protein at the Protein A step and host cell protein at the cation exchange step.</w:t>
+        <w:t xml:space="preserve">At the edges of the characterization range, cation exchange cleared host cell protein 27.2-fold, short of the platform worst case of 40.0-fold. Within the NOR, the lowest clearance the model predicts is 40.2-fold, and the single-batch bound is 32.9-fold. The edges of the characterization range lie outside the NOR, so the edge value does not decide the criterion. The prediction within the NOR confirms the platform value. The single-batch bound is below it, so the platform value of 40.0-fold stands for cation exchange. The verification used the models that INV-002 corrective action CA3 selects for each output (§2). At anion exchange, the single-batch bound for host cell protein is 4.18-fold, which is better than the platform value of 4.00-fold. The anion exchange model passes the adequacy tests, so this bound replaced the platform value. The anion exchange bound widened the cation exchange criterion for host cell protein from 400 to 418 ng/mg. Carried back through the platform value at cation exchange and this bound at anion exchange, the Protein A criterion for host cell protein was widened from 16,000 to 16,719 ng/mg. The Protein A criterion is also wider than the Version 1.0 limit of 10,724 ng/mg, which was never an approved criterion (finding F1). In all, 3 criteria were widened, for aggregates at the production bioreactor step, host cell protein at the Protein A step and host cell protein at the cation exchange step.</w:t>
       </w:r>
       <w:r>
         <w:t xml:space="preserve"> </w:t>
@@ -14296,7 +14412,7 @@
         <w:pStyle w:val="BodyText"/>
       </w:pPr>
       <w:r>
-        <w:t xml:space="preserve">One assumption was not confirmed. The platform worst case for aggregate at cation exchange is a fold clearance of 2.0. Within its NOR, the lowest fold clearance the response surface model of this campaign predicts is 1.58, and the single-batch bound is 1.40. The aggregate criteria upstream of cation exchange were recalculated with the bound, and the 2 aggregate criteria at the production bioreactor and low-pH viral inactivation steps were tightened. At the bioreactor the same criterion was also widened, because the single-batch bound of the aggregate increase at low-pH viral inactivation, 0.56 percentage points, is smaller than the platform value of 0.70. The platform value is an increase over a hold of 180 min. The A-Mab value is an increase within the NOR as characterized, where the hold lasts at most 120 min. For aggregate, the largest increase measured at the edges of the range studied, which include a hold of 180 min, is 0.84 points, above the platform value. That criterion therefore moved because the A-Mab hold is shorter, not because A-Mab is more stable at low pH. The criterion is still right, because routine manufacture does not hold longer than the NOR. The acidic-variant increase at low-pH viral inactivation, 0.40 points, is also below its platform value of 1.00, but its model fits exactly, so the bioreactor criterion for acidic variants stays at its a priori value. Against the tightened criteria, every aggregate proven acceptable range at these two steps still spans the whole characterization range, so the tightening moved no range.</w:t>
+        <w:t xml:space="preserve">Two assumptions were not confirmed, both for aggregate. The platform worst case for aggregate at cation exchange is a fold clearance of 2.0. Within its NOR, the lowest fold clearance the response surface model of this campaign predicts is 1.58, and the single-batch bound is 1.40. PCMP-001 assumed that no step after cation exchange changes aggregate. UF/DF raises it within its NOR, and the single-batch bound of the increase is 0.10 percentage points. The aggregate criteria upstream were recalculated with both bounds, and the 3 aggregate criteria at the production bioreactor, low-pH viral inactivation and cation exchange steps were tightened. The cation exchange criterion moved on the UF/DF bound alone, from the drug-substance criterion of 5 % to 4.90 %. At the bioreactor the aggregate criterion was also widened, because the single-batch bound of the aggregate increase at low-pH viral inactivation, 0.54 percentage points, is smaller than the platform value of 0.70. The platform value is an increase over a hold of 180 min. The A-Mab value is an increase within the NOR as characterized, where the hold lasts at most 120 min. For aggregate, the largest increase measured at the edges of the range studied, which include a hold of 180 min, is 0.82 points, above the platform value. That criterion therefore moved because the A-Mab hold is shorter, not because A-Mab is more stable at low pH. The criterion is still right, because routine manufacture does not hold longer than the NOR. The acidic-variant increase at low-pH viral inactivation, 0.13 points, is also below its platform value of 1.00, but its model fits exactly, so the bioreactor criterion for acidic variants stays at its a priori value. Against the tightened criteria, every aggregate proven acceptable range at these steps still spans the whole characterization range, so the tightening moved no range.</w:t>
       </w:r>
     </w:p>
     <w:p>
@@ -15340,7 +15456,7 @@
         <w:pStyle w:val="BodyText"/>
       </w:pPr>
       <w:r>
-        <w:t xml:space="preserve">At cation exchange, the Version 1.0 aggregate criterion of 1.00 % HMW was the drug-substance criterion divided by a safety factor of 5.0. Against it, the proven acceptable range for protein load, with the other parameters varying within their NORs, was 10–27.6 g/L resin. That range did not reach the upper end of the protein load NOR at 32 g/L resin. Against the Version 2.0 criterion of 5 %, the range is 10–40 g/L resin, and it covers the upper end of the NOR. At the bioreactor, the range for dissolved CO2 judged on galactosylation, computed the same way, was 74.5–160 mmHg at Version 1.0. It did not reach the lower end of the NOR at 70 mmHg. Judged against the drug-substance criterion, it is 40–160 mmHg.</w:t>
+        <w:t xml:space="preserve">At cation exchange, the Version 1.0 aggregate criterion of 1.00 % HMW was the drug-substance criterion divided by a safety factor of 5.0. Against it, the proven acceptable range for protein load, with the other parameters varying within their NORs, was 10–27.6 g/L resin. That range did not reach the upper end of the protein load NOR at 32 g/L resin. Against the Version 2.0 criterion of 4.90 %, the range is 10–40 g/L resin, and it covers the upper end of the NOR. At the bioreactor, the range for dissolved CO2 judged on galactosylation, computed the same way, was 74.5–160 mmHg at Version 1.0. It did not reach the lower end of the NOR at 70 mmHg. Judged against the drug-substance criterion, it is 40–160 mmHg.</w:t>
       </w:r>
     </w:p>
     <w:p>
@@ -15854,7 +15970,7 @@
                     <w:jc w:val="center"/>
                   </w:pPr>
                   <w:r>
-                    <w:t xml:space="preserve">≤ 6.46</w:t>
+                    <w:t xml:space="preserve">≤ 6.30</w:t>
                   </w:r>
                 </w:p>
               </w:tc>
@@ -15930,7 +16046,7 @@
                     <w:jc w:val="center"/>
                   </w:pPr>
                   <w:r>
-                    <w:t xml:space="preserve">≤ 17,069</w:t>
+                    <w:t xml:space="preserve">≤ 16,719</w:t>
                   </w:r>
                 </w:p>
               </w:tc>
@@ -16148,7 +16264,7 @@
                     <w:jc w:val="center"/>
                   </w:pPr>
                   <w:r>
-                    <w:t xml:space="preserve">≤ 7.02</w:t>
+                    <w:t xml:space="preserve">≤ 6.84</w:t>
                   </w:r>
                 </w:p>
               </w:tc>
@@ -16366,7 +16482,7 @@
                     <w:jc w:val="center"/>
                   </w:pPr>
                   <w:r>
-                    <w:t xml:space="preserve">≤ 5.00</w:t>
+                    <w:t xml:space="preserve">≤ 4.90</w:t>
                   </w:r>
                 </w:p>
               </w:tc>
@@ -16437,7 +16553,7 @@
                     <w:jc w:val="center"/>
                   </w:pPr>
                   <w:r>
-                    <w:t xml:space="preserve">≤ 427</w:t>
+                    <w:t xml:space="preserve">≤ 418</w:t>
                   </w:r>
                 </w:p>
               </w:tc>
@@ -17398,7 +17514,7 @@
         <w:pStyle w:val="FirstParagraph"/>
       </w:pPr>
       <w:r>
-        <w:t xml:space="preserve">No GMP batch of A-Mab was manufactured or dispositioned on the basis of these documents, and Version 1.0 was not used in a regulatory submission. The findings concern how the characterization data were judged. The experiments and the drug-substance criteria that existed in Version 1.0 are unchanged. The process is unchanged except for NORs at the Protein A and low-pH viral inactivation steps and set-points at low-pH viral inactivation, which PCR-005 and PCR-006 Version 2.0 change (§2, §6.3). Version 2.0 adds one drug-substance criterion, for fragments, at ≤ 2.00 %. There is no product impact.</w:t>
+        <w:t xml:space="preserve">No GMP batch of A-Mab was manufactured or dispositioned on the basis of these documents, and Version 1.0 was not used in a regulatory submission. The findings concern how the characterization data were judged. The experiments and the drug-substance criteria that existed in Version 1.0 are unchanged. The process is unchanged except for NORs and set-points at the low-pH viral inactivation step, which PCR-006 Version 2.0 changes (§6.3). Version 2.0 adds one drug-substance criterion, for fragments, at ≤ 2.00 %. There is no product impact.</w:t>
       </w:r>
     </w:p>
     <w:bookmarkEnd w:id="57"/>

</xml_diff>